<commit_message>
Reading list: confirm Christensen & Cornelissen from the full text
The user obtained the published PDF (MCQ 25(3), 383-414). Verified against
the article itself rather than publisher descriptions:

- polyphony is argued at length and proposed against control-based integration
- the consistency ideal is criticised directly
- the word 'authenticity' appears zero times in 32 pages

Removed the 'check before citing' flag and sharpened the stated gap
accordingly.

Co-Authored-By: Claude Opus 5 <noreply@anthropic.com>
Claude-Session: https://claude.ai/code/session_01Ktcn1DWC77yt7pkSoBhqbe
</commit_message>
<xml_diff>
--- a/literature-review/Reading_List_Manufacturing_Sincerity.docx
+++ b/literature-review/Reading_List_Manufacturing_Sincerity.docx
@@ -472,7 +472,7 @@
           <w:sz w:val="22"/>
           <w:szCs w:val="22"/>
         </w:rPr>
-        <w:t xml:space="preserve">The theoretical spine of your review, not a foil. They criticise the coherence ideal your paradox depends on, and they connect integration to control — the same move Fleming and Sturdy and Müller make empirically. Your gap is that their object is communication theory rather than authenticity, and the authenticity reviews ignore their critique.</w:t>
+        <w:t xml:space="preserve">The theoretical spine of your review, not a foil. They criticise the coherence ideal your paradox depends on, and they connect integration to control, the same move Fleming and Sturdy and Müller make empirically. Your gap is sharper than it looked: this paper builds the bridge between inside and outside without ever naming authenticity as what crosses it.</w:t>
       </w:r>
     </w:p>
     <w:p>
@@ -497,7 +497,7 @@
           <w:sz w:val="22"/>
           <w:szCs w:val="22"/>
         </w:rPr>
-        <w:t xml:space="preserve">Details now confirmed. The summary above comes from publisher and repository descriptions, not the full text — read the article before attributing specific claims to it.</w:t>
+        <w:t xml:space="preserve">You have the full text. Verified in the article itself: polyphony is argued at length, the coherence ideal is criticised directly, and the word authenticity never appears once in 32 pages. Quote it with confidence.</w:t>
       </w:r>
     </w:p>
     <w:p>

</xml_diff>